<commit_message>
dark and light mood implement
</commit_message>
<xml_diff>
--- a/src/assets/Mohammad_Moniruzzaman_Europass_CV_Draft.docx
+++ b/src/assets/Mohammad_Moniruzzaman_Europass_CV_Draft.docx
@@ -11,7 +11,7 @@
       </w:pPr>
       <w:r>
         <w:rPr/>
-        <w:t>EUROPASS CURRICULUM VITAE</w:t>
+        <w:t>CURRICULUM VITAE</w:t>
       </w:r>
     </w:p>
     <w:p>
@@ -38,7 +38,23 @@
       </w:r>
       <w:r>
         <w:rPr/>
-        <w:t>Full Stack Developer | Entrepreneur | Product Builder</w:t>
+        <w:t xml:space="preserve">Full Stack </w:t>
+      </w:r>
+      <w:r>
+        <w:rPr/>
+        <w:t>Web</w:t>
+      </w:r>
+      <w:r>
+        <w:rPr/>
+        <w:t xml:space="preserve"> </w:t>
+      </w:r>
+      <w:r>
+        <w:rPr/>
+        <w:t>Engineer</w:t>
+      </w:r>
+      <w:r>
+        <w:rPr/>
+        <w:t xml:space="preserve"> | Entrepreneur | Product Builder</w:t>
         <w:br/>
         <w:t>Dhaka, Bangladesh</w:t>
         <w:br/>
@@ -55,14 +71,7 @@
       <w:r>
         <w:rPr/>
         <w:br/>
-        <w:t xml:space="preserve">Phone: </w:t>
-      </w:r>
-      <w:r>
-        <w:rPr/>
-        <w:t>+8801782421132</w:t>
-      </w:r>
-      <w:r>
-        <w:rPr/>
+        <w:t>Phone: +8801782421132</w:t>
         <w:br/>
         <w:t xml:space="preserve">LinkedIn: </w:t>
       </w:r>
@@ -97,19 +106,7 @@
           <w:rPr>
             <w:rStyle w:val="InternetLink"/>
           </w:rPr>
-          <w:t>https://m</w:t>
-        </w:r>
-        <w:r>
-          <w:rPr>
-            <w:rStyle w:val="InternetLink"/>
-          </w:rPr>
-          <w:t>monirz-dev</w:t>
-        </w:r>
-        <w:r>
-          <w:rPr>
-            <w:rStyle w:val="InternetLink"/>
-          </w:rPr>
-          <w:t>.vercel.app/</w:t>
+          <w:t>https://mmonirz-dev.vercel.app/</w:t>
         </w:r>
       </w:hyperlink>
     </w:p>
@@ -131,7 +128,31 @@
       </w:pPr>
       <w:r>
         <w:rPr/>
-        <w:t>Full Stack Developer and entrepreneur with a multidisciplinary background spanning software development, digital product development, banking operations, visa processing, construction management, and business leadership. Currently building scalable web applications using React, Next.js, Node.js, Express.js, PostgreSQL, MongoDB, and Tailwind CSS while leading Touch &amp; Greet, a company focused on NFC-powered digital identity solutions. Passionate about building software that solves real-world business problems.</w:t>
+        <w:t xml:space="preserve">Full Stack </w:t>
+      </w:r>
+      <w:r>
+        <w:rPr/>
+        <w:t xml:space="preserve">Web </w:t>
+      </w:r>
+      <w:r>
+        <w:rPr/>
+        <w:t xml:space="preserve">Developer and entrepreneur with a multidisciplinary background spanning software development, digital product development, banking operations, visa processing, construction management, and business leadership. Currently building scalable web applications using </w:t>
+      </w:r>
+      <w:r>
+        <w:rPr/>
+        <w:t xml:space="preserve">HTML, CSS, JavaScript, TypeScript, </w:t>
+      </w:r>
+      <w:r>
+        <w:rPr/>
+        <w:t xml:space="preserve">React, Next.js, Node.js, Express.js, PostgreSQL, MongoDB, </w:t>
+      </w:r>
+      <w:r>
+        <w:rPr/>
+        <w:t xml:space="preserve">Prisma, </w:t>
+      </w:r>
+      <w:r>
+        <w:rPr/>
+        <w:t>and Tailwind CSS while leading Touch &amp; Greet, a company focused on NFC-powered digital identity solutions. Passionate about building software that solves real-world business problems.</w:t>
       </w:r>
     </w:p>
     <w:p>
@@ -445,17 +466,59 @@
     <w:p>
       <w:pPr>
         <w:pStyle w:val="Normal"/>
+        <w:jc w:val="left"/>
         <w:rPr/>
       </w:pPr>
+      <w:r>
+        <w:rPr>
+          <w:b/>
+          <w:bCs/>
+        </w:rPr>
+        <w:t>Frontend:</w:t>
+      </w:r>
       <w:r>
         <w:rPr/>
-        <w:t>Frontend: HTML5, CSS3, JavaScript, TypeScript, React, Next.js, Tailwind CSS</w:t>
+        <w:t xml:space="preserve"> HTML5, CSS3, JavaScript, TypeScript, React, Next.js, Tailwind CSS</w:t>
         <w:br/>
-        <w:t>Backend: Node.js, Express.js, REST APIs</w:t>
+      </w:r>
+      <w:r>
+        <w:rPr>
+          <w:b/>
+          <w:bCs/>
+        </w:rPr>
+        <w:t>Backend:</w:t>
+      </w:r>
+      <w:r>
+        <w:rPr/>
+        <w:t xml:space="preserve"> Node.js, Express.js, REST APIs</w:t>
         <w:br/>
-        <w:t>Database: PostgreSQL, MongoDB, Prisma, MySQL</w:t>
+      </w:r>
+      <w:r>
+        <w:rPr>
+          <w:b/>
+          <w:bCs/>
+        </w:rPr>
+        <w:t>Database:</w:t>
+      </w:r>
+      <w:r>
+        <w:rPr/>
+        <w:t xml:space="preserve"> PostgreSQL, MongoDB, Prisma, </w:t>
         <w:br/>
-        <w:t>Tools: Git, GitHub, Docker, Postman, VS Code, Linux, Figma</w:t>
+      </w:r>
+      <w:r>
+        <w:rPr>
+          <w:b/>
+          <w:bCs/>
+        </w:rPr>
+        <w:t>Tools:</w:t>
+      </w:r>
+      <w:r>
+        <w:rPr/>
+        <w:t xml:space="preserve"> Git, GitHub, Postman, VS Code, Linux, Figma, </w:t>
+      </w:r>
+      <w:r>
+        <w:rPr/>
+        <w:t>Vercel, Netlify</w:t>
       </w:r>
     </w:p>
     <w:p>
@@ -583,7 +646,27 @@
       </w:pPr>
       <w:r>
         <w:rPr/>
-        <w:t>Complete Web Development Program – Programming Hero (Ongoing)</w:t>
+        <w:t xml:space="preserve">Next Level </w:t>
+      </w:r>
+      <w:r>
+        <w:rPr/>
+        <w:t xml:space="preserve">Web </w:t>
+      </w:r>
+      <w:r>
+        <w:rPr/>
+        <w:t>Engineering</w:t>
+      </w:r>
+      <w:r>
+        <w:rPr/>
+        <w:t xml:space="preserve"> Program</w:t>
+      </w:r>
+      <w:r>
+        <w:rPr/>
+        <w:t>(L2B7)</w:t>
+      </w:r>
+      <w:r>
+        <w:rPr/>
+        <w:t xml:space="preserve"> – Programming Hero (Ongoing)</w:t>
       </w:r>
     </w:p>
     <w:p>
@@ -654,6 +737,7 @@
         </w:tabs>
         <w:ind w:left="1080" w:hanging="360"/>
       </w:pPr>
+      <w:rPr/>
     </w:lvl>
     <w:lvl w:ilvl="2">
       <w:start w:val="1"/>
@@ -666,6 +750,7 @@
         </w:tabs>
         <w:ind w:left="1440" w:hanging="360"/>
       </w:pPr>
+      <w:rPr/>
     </w:lvl>
     <w:lvl w:ilvl="3">
       <w:start w:val="1"/>
@@ -678,6 +763,7 @@
         </w:tabs>
         <w:ind w:left="1800" w:hanging="360"/>
       </w:pPr>
+      <w:rPr/>
     </w:lvl>
     <w:lvl w:ilvl="4">
       <w:start w:val="1"/>
@@ -690,6 +776,7 @@
         </w:tabs>
         <w:ind w:left="2160" w:hanging="360"/>
       </w:pPr>
+      <w:rPr/>
     </w:lvl>
     <w:lvl w:ilvl="5">
       <w:start w:val="1"/>
@@ -702,6 +789,7 @@
         </w:tabs>
         <w:ind w:left="2520" w:hanging="360"/>
       </w:pPr>
+      <w:rPr/>
     </w:lvl>
     <w:lvl w:ilvl="6">
       <w:start w:val="1"/>
@@ -714,6 +802,7 @@
         </w:tabs>
         <w:ind w:left="2880" w:hanging="360"/>
       </w:pPr>
+      <w:rPr/>
     </w:lvl>
     <w:lvl w:ilvl="7">
       <w:start w:val="1"/>
@@ -726,6 +815,7 @@
         </w:tabs>
         <w:ind w:left="3240" w:hanging="360"/>
       </w:pPr>
+      <w:rPr/>
     </w:lvl>
     <w:lvl w:ilvl="8">
       <w:start w:val="1"/>
@@ -738,6 +828,7 @@
         </w:tabs>
         <w:ind w:left="3600" w:hanging="360"/>
       </w:pPr>
+      <w:rPr/>
     </w:lvl>
   </w:abstractNum>
   <w:abstractNum w:abstractNumId="2">
@@ -767,6 +858,7 @@
         </w:tabs>
         <w:ind w:left="1080" w:hanging="360"/>
       </w:pPr>
+      <w:rPr/>
     </w:lvl>
     <w:lvl w:ilvl="2">
       <w:start w:val="1"/>
@@ -779,6 +871,7 @@
         </w:tabs>
         <w:ind w:left="1440" w:hanging="360"/>
       </w:pPr>
+      <w:rPr/>
     </w:lvl>
     <w:lvl w:ilvl="3">
       <w:start w:val="1"/>
@@ -791,6 +884,7 @@
         </w:tabs>
         <w:ind w:left="1800" w:hanging="360"/>
       </w:pPr>
+      <w:rPr/>
     </w:lvl>
     <w:lvl w:ilvl="4">
       <w:start w:val="1"/>
@@ -803,6 +897,7 @@
         </w:tabs>
         <w:ind w:left="2160" w:hanging="360"/>
       </w:pPr>
+      <w:rPr/>
     </w:lvl>
     <w:lvl w:ilvl="5">
       <w:start w:val="1"/>
@@ -815,6 +910,7 @@
         </w:tabs>
         <w:ind w:left="2520" w:hanging="360"/>
       </w:pPr>
+      <w:rPr/>
     </w:lvl>
     <w:lvl w:ilvl="6">
       <w:start w:val="1"/>
@@ -827,6 +923,7 @@
         </w:tabs>
         <w:ind w:left="2880" w:hanging="360"/>
       </w:pPr>
+      <w:rPr/>
     </w:lvl>
     <w:lvl w:ilvl="7">
       <w:start w:val="1"/>
@@ -839,6 +936,7 @@
         </w:tabs>
         <w:ind w:left="3240" w:hanging="360"/>
       </w:pPr>
+      <w:rPr/>
     </w:lvl>
     <w:lvl w:ilvl="8">
       <w:start w:val="1"/>
@@ -851,6 +949,7 @@
         </w:tabs>
         <w:ind w:left="3600" w:hanging="360"/>
       </w:pPr>
+      <w:rPr/>
     </w:lvl>
   </w:abstractNum>
   <w:abstractNum w:abstractNumId="3">
@@ -880,6 +979,7 @@
         </w:tabs>
         <w:ind w:left="1080" w:hanging="360"/>
       </w:pPr>
+      <w:rPr/>
     </w:lvl>
     <w:lvl w:ilvl="2">
       <w:start w:val="1"/>
@@ -892,6 +992,7 @@
         </w:tabs>
         <w:ind w:left="1440" w:hanging="360"/>
       </w:pPr>
+      <w:rPr/>
     </w:lvl>
     <w:lvl w:ilvl="3">
       <w:start w:val="1"/>
@@ -904,6 +1005,7 @@
         </w:tabs>
         <w:ind w:left="1800" w:hanging="360"/>
       </w:pPr>
+      <w:rPr/>
     </w:lvl>
     <w:lvl w:ilvl="4">
       <w:start w:val="1"/>
@@ -916,6 +1018,7 @@
         </w:tabs>
         <w:ind w:left="2160" w:hanging="360"/>
       </w:pPr>
+      <w:rPr/>
     </w:lvl>
     <w:lvl w:ilvl="5">
       <w:start w:val="1"/>
@@ -928,6 +1031,7 @@
         </w:tabs>
         <w:ind w:left="2520" w:hanging="360"/>
       </w:pPr>
+      <w:rPr/>
     </w:lvl>
     <w:lvl w:ilvl="6">
       <w:start w:val="1"/>
@@ -940,6 +1044,7 @@
         </w:tabs>
         <w:ind w:left="2880" w:hanging="360"/>
       </w:pPr>
+      <w:rPr/>
     </w:lvl>
     <w:lvl w:ilvl="7">
       <w:start w:val="1"/>
@@ -952,6 +1057,7 @@
         </w:tabs>
         <w:ind w:left="3240" w:hanging="360"/>
       </w:pPr>
+      <w:rPr/>
     </w:lvl>
     <w:lvl w:ilvl="8">
       <w:start w:val="1"/>
@@ -964,6 +1070,7 @@
         </w:tabs>
         <w:ind w:left="3600" w:hanging="360"/>
       </w:pPr>
+      <w:rPr/>
     </w:lvl>
   </w:abstractNum>
   <w:abstractNum w:abstractNumId="4">
@@ -991,6 +1098,7 @@
         </w:tabs>
         <w:ind w:left="1080" w:hanging="360"/>
       </w:pPr>
+      <w:rPr/>
     </w:lvl>
     <w:lvl w:ilvl="2">
       <w:start w:val="1"/>
@@ -1003,6 +1111,7 @@
         </w:tabs>
         <w:ind w:left="1440" w:hanging="360"/>
       </w:pPr>
+      <w:rPr/>
     </w:lvl>
     <w:lvl w:ilvl="3">
       <w:start w:val="1"/>
@@ -1015,6 +1124,7 @@
         </w:tabs>
         <w:ind w:left="1800" w:hanging="360"/>
       </w:pPr>
+      <w:rPr/>
     </w:lvl>
     <w:lvl w:ilvl="4">
       <w:start w:val="1"/>
@@ -1027,6 +1137,7 @@
         </w:tabs>
         <w:ind w:left="2160" w:hanging="360"/>
       </w:pPr>
+      <w:rPr/>
     </w:lvl>
     <w:lvl w:ilvl="5">
       <w:start w:val="1"/>
@@ -1039,6 +1150,7 @@
         </w:tabs>
         <w:ind w:left="2520" w:hanging="360"/>
       </w:pPr>
+      <w:rPr/>
     </w:lvl>
     <w:lvl w:ilvl="6">
       <w:start w:val="1"/>
@@ -1051,6 +1163,7 @@
         </w:tabs>
         <w:ind w:left="2880" w:hanging="360"/>
       </w:pPr>
+      <w:rPr/>
     </w:lvl>
     <w:lvl w:ilvl="7">
       <w:start w:val="1"/>
@@ -1063,6 +1176,7 @@
         </w:tabs>
         <w:ind w:left="3240" w:hanging="360"/>
       </w:pPr>
+      <w:rPr/>
     </w:lvl>
     <w:lvl w:ilvl="8">
       <w:start w:val="1"/>
@@ -1075,6 +1189,7 @@
         </w:tabs>
         <w:ind w:left="3600" w:hanging="360"/>
       </w:pPr>
+      <w:rPr/>
     </w:lvl>
   </w:abstractNum>
   <w:abstractNum w:abstractNumId="5">
@@ -1102,6 +1217,7 @@
         </w:tabs>
         <w:ind w:left="1080" w:hanging="360"/>
       </w:pPr>
+      <w:rPr/>
     </w:lvl>
     <w:lvl w:ilvl="2">
       <w:start w:val="1"/>
@@ -1114,6 +1230,7 @@
         </w:tabs>
         <w:ind w:left="1440" w:hanging="360"/>
       </w:pPr>
+      <w:rPr/>
     </w:lvl>
     <w:lvl w:ilvl="3">
       <w:start w:val="1"/>
@@ -1126,6 +1243,7 @@
         </w:tabs>
         <w:ind w:left="1800" w:hanging="360"/>
       </w:pPr>
+      <w:rPr/>
     </w:lvl>
     <w:lvl w:ilvl="4">
       <w:start w:val="1"/>
@@ -1138,6 +1256,7 @@
         </w:tabs>
         <w:ind w:left="2160" w:hanging="360"/>
       </w:pPr>
+      <w:rPr/>
     </w:lvl>
     <w:lvl w:ilvl="5">
       <w:start w:val="1"/>
@@ -1150,6 +1269,7 @@
         </w:tabs>
         <w:ind w:left="2520" w:hanging="360"/>
       </w:pPr>
+      <w:rPr/>
     </w:lvl>
     <w:lvl w:ilvl="6">
       <w:start w:val="1"/>
@@ -1162,6 +1282,7 @@
         </w:tabs>
         <w:ind w:left="2880" w:hanging="360"/>
       </w:pPr>
+      <w:rPr/>
     </w:lvl>
     <w:lvl w:ilvl="7">
       <w:start w:val="1"/>
@@ -1174,6 +1295,7 @@
         </w:tabs>
         <w:ind w:left="3240" w:hanging="360"/>
       </w:pPr>
+      <w:rPr/>
     </w:lvl>
     <w:lvl w:ilvl="8">
       <w:start w:val="1"/>
@@ -1186,6 +1308,7 @@
         </w:tabs>
         <w:ind w:left="3600" w:hanging="360"/>
       </w:pPr>
+      <w:rPr/>
     </w:lvl>
   </w:abstractNum>
   <w:abstractNum w:abstractNumId="6">
@@ -1213,6 +1336,7 @@
         </w:tabs>
         <w:ind w:left="1080" w:hanging="360"/>
       </w:pPr>
+      <w:rPr/>
     </w:lvl>
     <w:lvl w:ilvl="2">
       <w:start w:val="1"/>
@@ -1225,6 +1349,7 @@
         </w:tabs>
         <w:ind w:left="1440" w:hanging="360"/>
       </w:pPr>
+      <w:rPr/>
     </w:lvl>
     <w:lvl w:ilvl="3">
       <w:start w:val="1"/>
@@ -1237,6 +1362,7 @@
         </w:tabs>
         <w:ind w:left="1800" w:hanging="360"/>
       </w:pPr>
+      <w:rPr/>
     </w:lvl>
     <w:lvl w:ilvl="4">
       <w:start w:val="1"/>
@@ -1249,6 +1375,7 @@
         </w:tabs>
         <w:ind w:left="2160" w:hanging="360"/>
       </w:pPr>
+      <w:rPr/>
     </w:lvl>
     <w:lvl w:ilvl="5">
       <w:start w:val="1"/>
@@ -1261,6 +1388,7 @@
         </w:tabs>
         <w:ind w:left="2520" w:hanging="360"/>
       </w:pPr>
+      <w:rPr/>
     </w:lvl>
     <w:lvl w:ilvl="6">
       <w:start w:val="1"/>
@@ -1273,6 +1401,7 @@
         </w:tabs>
         <w:ind w:left="2880" w:hanging="360"/>
       </w:pPr>
+      <w:rPr/>
     </w:lvl>
     <w:lvl w:ilvl="7">
       <w:start w:val="1"/>
@@ -1285,6 +1414,7 @@
         </w:tabs>
         <w:ind w:left="3240" w:hanging="360"/>
       </w:pPr>
+      <w:rPr/>
     </w:lvl>
     <w:lvl w:ilvl="8">
       <w:start w:val="1"/>
@@ -1297,6 +1427,7 @@
         </w:tabs>
         <w:ind w:left="3600" w:hanging="360"/>
       </w:pPr>
+      <w:rPr/>
     </w:lvl>
   </w:abstractNum>
   <w:abstractNum w:abstractNumId="7">
@@ -1604,6 +1735,7 @@
     <w:rsid w:val="00fc693f"/>
     <w:pPr>
       <w:widowControl/>
+      <w:suppressAutoHyphens w:val="true"/>
       <w:bidi w:val="0"/>
       <w:spacing w:lineRule="auto" w:line="276" w:before="0" w:after="200"/>
       <w:jc w:val="left"/>
@@ -2303,6 +2435,7 @@
     <w:rsid w:val="00fc693f"/>
     <w:pPr>
       <w:widowControl/>
+      <w:suppressAutoHyphens w:val="true"/>
       <w:bidi w:val="0"/>
       <w:spacing w:lineRule="auto" w:line="240" w:before="0" w:after="0"/>
       <w:jc w:val="left"/>
@@ -2401,24 +2534,29 @@
       <w:szCs w:val="16"/>
     </w:rPr>
   </w:style>
-  <w:style w:type="paragraph" w:styleId="List2">
+  <w:style w:type="paragraph" w:styleId="ListBullet3">
     <w:name w:val="List Bullet 3"/>
     <w:basedOn w:val="Normal"/>
     <w:uiPriority w:val="99"/>
     <w:unhideWhenUsed/>
+    <w:qFormat/>
     <w:rsid w:val="00326f90"/>
     <w:pPr>
+      <w:numPr>
+        <w:ilvl w:val="0"/>
+        <w:numId w:val="3"/>
+      </w:numPr>
       <w:spacing w:before="0" w:after="200"/>
-      <w:ind w:left="720" w:hanging="360"/>
       <w:contextualSpacing/>
     </w:pPr>
     <w:rPr/>
   </w:style>
-  <w:style w:type="paragraph" w:styleId="List3">
+  <w:style w:type="paragraph" w:styleId="ListBullet4">
     <w:name w:val="List Bullet 4"/>
     <w:basedOn w:val="Normal"/>
     <w:uiPriority w:val="99"/>
     <w:unhideWhenUsed/>
+    <w:qFormat/>
     <w:rsid w:val="00326f90"/>
     <w:pPr>
       <w:spacing w:before="0" w:after="200"/>
@@ -2455,23 +2593,6 @@
       <w:numPr>
         <w:ilvl w:val="0"/>
         <w:numId w:val="2"/>
-      </w:numPr>
-      <w:spacing w:before="0" w:after="200"/>
-      <w:contextualSpacing/>
-    </w:pPr>
-    <w:rPr/>
-  </w:style>
-  <w:style w:type="paragraph" w:styleId="ListBullet3">
-    <w:name w:val="List Bullet 3"/>
-    <w:basedOn w:val="Normal"/>
-    <w:uiPriority w:val="99"/>
-    <w:unhideWhenUsed/>
-    <w:qFormat/>
-    <w:rsid w:val="00326f90"/>
-    <w:pPr>
-      <w:numPr>
-        <w:ilvl w:val="0"/>
-        <w:numId w:val="3"/>
       </w:numPr>
       <w:spacing w:before="0" w:after="200"/>
       <w:contextualSpacing/>
@@ -2590,6 +2711,7 @@
         <w:tab w:val="left" w:pos="3456" w:leader="none"/>
         <w:tab w:val="left" w:pos="4032" w:leader="none"/>
       </w:tabs>
+      <w:suppressAutoHyphens w:val="true"/>
       <w:bidi w:val="0"/>
       <w:spacing w:lineRule="auto" w:line="276" w:before="0" w:after="200"/>
       <w:jc w:val="left"/>

</xml_diff>